<commit_message>
Changes with .git... files
</commit_message>
<xml_diff>
--- a/Ancestry_Application__Job_Descriptions_for_Previous_Jobs.docx
+++ b/Ancestry_Application__Job_Descriptions_for_Previous_Jobs.docx
@@ -19,20 +19,35 @@
       <w:pPr>
         <w:pStyle w:val="Heading2"/>
       </w:pPr>
+      <w:proofErr w:type="spellStart"/>
       <w:r>
         <w:t>CaptionCall</w:t>
       </w:r>
-    </w:p>
-    <w:p/>
-    <w:p>
-      <w:r>
-        <w:t>CaptionCall is a provider of captioning services on special telephones available to hard-of-hearing individuals through the Americans with Disabilities Act. They are subcontracted by the FCC, who administ</w:t>
+      <w:proofErr w:type="spellEnd"/>
+    </w:p>
+    <w:p/>
+    <w:p>
+      <w:proofErr w:type="spellStart"/>
+      <w:r>
+        <w:t>CaptionCall</w:t>
+      </w:r>
+      <w:proofErr w:type="spellEnd"/>
+      <w:r>
+        <w:t xml:space="preserve"> is a provider of captioning services on special telephones available to hard-of-hearing individuals through the Americans with Disabilities Act. They are subcontracted by the FCC, who administ</w:t>
       </w:r>
       <w:r>
         <w:t>er</w:t>
       </w:r>
       <w:r>
-        <w:t xml:space="preserve"> the ADA program for the deaf and hard-of-hearing. CaptionCall is an outgrowth of Sorenson Communications, who provide video-relay services for the deaf through American Sign Language. </w:t>
+        <w:t xml:space="preserve"> the ADA program for the deaf and hard-of-hearing. </w:t>
+      </w:r>
+      <w:proofErr w:type="spellStart"/>
+      <w:r>
+        <w:t>CaptionCall</w:t>
+      </w:r>
+      <w:proofErr w:type="spellEnd"/>
+      <w:r>
+        <w:t xml:space="preserve"> is an outgrowth of Sorenson Communications, who provide video-relay services for the deaf through American Sign Language. </w:t>
       </w:r>
     </w:p>
     <w:p/>
@@ -79,6 +94,11 @@
     </w:p>
     <w:p>
       <w:r>
+        <w:t>- Contribute to a long-range project combining the best of human transcribers with the best of machine transcribers for increased accuracy.</w:t>
+      </w:r>
+    </w:p>
+    <w:p>
+      <w:r>
         <w:t>- Create an iterative break-testing set of text transcriptions - regression testing - for any text normalization.</w:t>
       </w:r>
     </w:p>
@@ -109,12 +129,12 @@
     </w:p>
     <w:p>
       <w:r>
+        <w:lastRenderedPageBreak/>
         <w:t>- Develop a robust method of silence detection and removal, then of splicing the mostly-spoken sections into audio files with a specific time length. Administer these audios to different transcribers and analyze the results.</w:t>
       </w:r>
     </w:p>
     <w:p>
       <w:r>
-        <w:lastRenderedPageBreak/>
         <w:t>- Broaden the marketable products and services available with machine learning methods and models that relate to speech and language with a special focus on serving underrepresented groups such as the Deaf and Hard-of-Hearing communities.</w:t>
       </w:r>
     </w:p>
@@ -365,9 +385,11 @@
     </w:p>
     <w:p/>
     <w:p>
+      <w:proofErr w:type="spellStart"/>
       <w:r>
         <w:t>fgadsdfa</w:t>
       </w:r>
+      <w:proofErr w:type="spellEnd"/>
     </w:p>
     <w:p/>
     <w:p>

</xml_diff>